<commit_message>
Rebuild Gutachten scaffold around the verified DAAD criteria
Replaces the eleven convention-derived sections with seven organised around
the three criteria the Deckblatt names and instructs the referee to follow,
quoting each verbatim. Drops the free-text ranking sentence, which is a
checkbox on the cover sheet, and replaces it with the comparison-group
explanation the cover sheet requires in the letter. Adds grade development,
working-language capability and the embedding of the project in the prior
course of study, all named in the criteria.

Co-Authored-By: Claude Opus 5 <noreply@anthropic.com>
Claude-Session: https://claude.ai/code/session_018EEFYAf6pBJaMga5G9Xzjo
</commit_message>
<xml_diff>
--- a/research/daad/Gutachten_Geruest.docx
+++ b/research/daad/Gutachten_Geruest.docx
@@ -15,7 +15,7 @@
           <w:sz w:val="17"/>
           <w:szCs w:val="17"/>
         </w:rPr>
-        <w:t xml:space="preserve">GERÜST — kein Textentwurf</w:t>
+        <w:t xml:space="preserve">GERÜST für den frei formulierten Teil — kein Textentwurf</w:t>
       </w:r>
     </w:p>
     <w:p>
@@ -28,24 +28,24 @@
           <w:b/>
           <w:bCs/>
           <w:color w:val="1F3864"/>
-          <w:sz w:val="32"/>
-          <w:szCs w:val="32"/>
-        </w:rPr>
-        <w:t xml:space="preserve">Gutachten für eine DAAD-Stipendienbewerbung</w:t>
-      </w:r>
-    </w:p>
-    <w:p>
-      <w:pPr>
-        <w:spacing w:after="240" w:before="0" w:line="276"/>
-      </w:pPr>
-      <w:r>
-        <w:rPr>
-          <w:rFonts w:ascii="Calibri" w:cs="Calibri" w:eastAsia="Calibri" w:hAnsi="Calibri"/>
-          <w:color w:val="595959"/>
-          <w:sz w:val="19"/>
-          <w:szCs w:val="19"/>
-        </w:rPr>
-        <w:t xml:space="preserve">MPhil in Industrial Systems, Manufacture and Management · Institute for Manufacturing, Department of Engineering · University of Cambridge · Studienbeginn Oktober 2027</w:t>
+          <w:sz w:val="30"/>
+          <w:szCs w:val="30"/>
+        </w:rPr>
+        <w:t xml:space="preserve">Empfehlungsschreiben für eine DAAD-Stipendienbewerbung</w:t>
+      </w:r>
+    </w:p>
+    <w:p>
+      <w:pPr>
+        <w:spacing w:after="220" w:before="0" w:line="276"/>
+      </w:pPr>
+      <w:r>
+        <w:rPr>
+          <w:rFonts w:ascii="Calibri" w:cs="Calibri" w:eastAsia="Calibri" w:hAnsi="Calibri"/>
+          <w:color w:val="595959"/>
+          <w:sz w:val="19"/>
+          <w:szCs w:val="19"/>
+        </w:rPr>
+        <w:t xml:space="preserve">MPhil in Industrial Systems, Manufacture and Management · Institute for Manufacturing, Department of Engineering · University of Cambridge · Förderbeginn Oktober 2027</w:t>
       </w:r>
     </w:p>
     <w:tbl>
@@ -102,7 +102,7 @@
                 <w:sz w:val="19"/>
                 <w:szCs w:val="19"/>
               </w:rPr>
-              <w:t xml:space="preserve">Dies ist bewusst kein vorformulierter Brief, sondern ein Gerüst: Abschnitte, Leitfragen und Umfangshinweise. Die Formulierung stammt vollständig von Ihnen.</w:t>
+              <w:t xml:space="preserve">Die Bewerbung besteht aus zwei Teilen: dem DAAD-Deckblatt und einem frei formulierten Empfehlungsschreiben auf Ihrem Briefbogen. Dieses Gerüst betrifft nur den zweiten Teil.</w:t>
             </w:r>
           </w:p>
           <w:p>
@@ -116,7 +116,7 @@
                 <w:sz w:val="19"/>
                 <w:szCs w:val="19"/>
               </w:rPr>
-              <w:t xml:space="preserve">Auf dem beiliegenden DAAD-Deckblatt stehen die verbindlichen Hinweise des DAAD an Gutachtende. Diese gehen allem auf diesem Blatt vor.</w:t>
+              <w:t xml:space="preserve">Es enthält bewusst keinen vorformulierten Text. Die Gliederung folgt den drei Auswahlkriterien, die der DAAD auf Seite 2 des Deckblatts nennt — dort heißt es ausdrücklich: „Bitte beachten Sie diese Kriterien bei der Formulierung Ihres Empfehlungsschreibens.“</w:t>
             </w:r>
           </w:p>
           <w:p>
@@ -130,7 +130,7 @@
                 <w:sz w:val="19"/>
                 <w:szCs w:val="19"/>
               </w:rPr>
-              <w:t xml:space="preserve">Sprache: Deutsch. Umfang: etwa eine Seite. Form: institutioneller Briefkopf, Datum, Unterschrift, ggf. Stempel.</w:t>
+              <w:t xml:space="preserve">Umfang etwa eine Seite. Sprache Deutsch. Unterschrift handschriftlich oder elektronisch.</w:t>
             </w:r>
           </w:p>
           <w:p>
@@ -144,7 +144,7 @@
                 <w:sz w:val="19"/>
                 <w:szCs w:val="19"/>
               </w:rPr>
-              <w:t xml:space="preserve">Rückgabe an den Bewerber (Deckblatt und Schreiben) — es gibt für dieses Programm kein Gutachterportal und keinen E-Mail-Weg zum DAAD.</w:t>
+              <w:t xml:space="preserve">Rückgabe von Deckblatt und Schreiben an den Bewerber, der beides im DAAD-Portal hochlädt. Es gibt kein Gutachterportal und keinen E-Mail-Weg zum DAAD.</w:t>
             </w:r>
           </w:p>
           <w:p>
@@ -217,7 +217,7 @@
                 <w:sz w:val="20"/>
                 <w:szCs w:val="20"/>
               </w:rPr>
-              <w:t xml:space="preserve">Worauf der DAAD schaut</w:t>
+              <w:t xml:space="preserve">Zwei Dinge, die das Deckblatt bereits abfragt</w:t>
             </w:r>
           </w:p>
           <w:p>
@@ -231,7 +231,7 @@
                 <w:sz w:val="19"/>
                 <w:szCs w:val="19"/>
               </w:rPr>
-              <w:t xml:space="preserve">Beurteilt werden fachliche Qualifikation, Qualität des Studienvorhabens und Potenzial — dazu ausdrücklich Sprachkenntnisse, Motivation und außerfachliches Engagement.</w:t>
+              <w:t xml:space="preserve">Ankreuzfeld „zählt zu den fachlich besten 5 % / 10 % / 20 % / 30 % / keine Aussage möglich“ — die Rangaussage selbst gehört also auf das Deckblatt, nicht in den Brief.</w:t>
             </w:r>
           </w:p>
           <w:p>
@@ -245,7 +245,21 @@
                 <w:sz w:val="19"/>
                 <w:szCs w:val="19"/>
               </w:rPr>
-              <w:t xml:space="preserve">Die Auswahlkommission besteht überwiegend aus Hochschullehrenden anderer Fachrichtungen. Fachbegriffe der Wirtschaftsinformatik und der Fertigungstechnik sollten daher kurz eingeordnet werden.</w:t>
+              <w:t xml:space="preserve">Aber: Das Deckblatt verlangt zur Vergleichsgruppe ausdrücklich „bitte im frei formulierten Teil erläutern“. Die Größe und Art der Vergleichsgruppe muss daher in diesem Schreiben stehen — siehe Abschnitt 2.</w:t>
+            </w:r>
+          </w:p>
+          <w:p>
+            <w:pPr>
+              <w:spacing w:after="50" w:before="0" w:line="276"/>
+            </w:pPr>
+            <w:r>
+              <w:rPr>
+                <w:rFonts w:ascii="Calibri" w:cs="Calibri" w:eastAsia="Calibri" w:hAnsi="Calibri"/>
+                <w:color w:val="333333"/>
+                <w:sz w:val="19"/>
+                <w:szCs w:val="19"/>
+              </w:rPr>
+              <w:t xml:space="preserve">Ebenso bereits auf dem Deckblatt: „Ich kenne … gut / flüchtig seit ___“ und „aus dem folgenden Kontext“. Im Brief bitte nicht wiederholen, sondern vertiefen.</w:t>
             </w:r>
           </w:p>
         </w:tc>
@@ -267,7 +281,7 @@
           <w:sz w:val="23"/>
           <w:szCs w:val="23"/>
         </w:rPr>
-        <w:t xml:space="preserve">1. Betreff</w:t>
+        <w:t xml:space="preserve">1. Betreff und Einstieg</w:t>
       </w:r>
       <w:r>
         <w:rPr>
@@ -278,7 +292,7 @@
           <w:sz w:val="18"/>
           <w:szCs w:val="18"/>
         </w:rPr>
-        <w:t xml:space="preserve">   2 Zeilen</w:t>
+        <w:t xml:space="preserve">   2–3 Zeilen</w:t>
       </w:r>
     </w:p>
     <w:p>
@@ -295,7 +309,7 @@
           <w:sz w:val="19"/>
           <w:szCs w:val="19"/>
         </w:rPr>
-        <w:t xml:space="preserve">– Exakter Programm- und Universitätsname (siehe Kopf dieses Blattes) sowie vollständiger Name des Bewerbers.</w:t>
+        <w:t xml:space="preserve">– Vollständiger Name des Bewerbers und exakter Studiengang- und Universitätsname (siehe Kopf dieses Blattes).</w:t>
       </w:r>
     </w:p>
     <w:p>
@@ -312,7 +326,7 @@
           <w:sz w:val="19"/>
           <w:szCs w:val="19"/>
         </w:rPr>
-        <w:t xml:space="preserve">– Grund: Ein falsch benannter Studiengang ist der formale Fehler, der ein Gutachten am schnellsten entwertet.</w:t>
+        <w:t xml:space="preserve">– Ein falsch benannter Studiengang ist der formale Fehler, der ein Empfehlungsschreiben am schnellsten entwertet.</w:t>
       </w:r>
     </w:p>
     <w:p>
@@ -361,7 +375,7 @@
           <w:sz w:val="23"/>
           <w:szCs w:val="23"/>
         </w:rPr>
-        <w:t xml:space="preserve">2. Kenntnisgrundlage</w:t>
+        <w:t xml:space="preserve">2. Kenntnisgrundlage und Vergleichsgruppe</w:t>
       </w:r>
       <w:r>
         <w:rPr>
@@ -372,7 +386,7 @@
           <w:sz w:val="18"/>
           <w:szCs w:val="18"/>
         </w:rPr>
-        <w:t xml:space="preserve">   2–4 Sätze · bitte nicht auslassen</w:t>
+        <w:t xml:space="preserve">   2–4 Sätze · Pflichtangabe</w:t>
       </w:r>
     </w:p>
     <w:p>
@@ -389,7 +403,7 @@
           <w:sz w:val="19"/>
           <w:szCs w:val="19"/>
         </w:rPr>
-        <w:t xml:space="preserve">– Seit wann und in welcher Rolle kennen Sie den Bewerber?</w:t>
+        <w:t xml:space="preserve">– Nicht wiederholen, was auf dem Deckblatt steht — vertiefen: welche Lehrveranstaltungen, welche Betreuung, welcher Zeitraum, welche Art der Zusammenarbeit.</w:t>
       </w:r>
     </w:p>
     <w:p>
@@ -406,7 +420,7 @@
           <w:sz w:val="19"/>
           <w:szCs w:val="19"/>
         </w:rPr>
-        <w:t xml:space="preserve">– Welche Lehrveranstaltungen, welche Betreuung, welcher Zeitraum?</w:t>
+        <w:t xml:space="preserve">– PFLICHT laut Deckblatt: Größe und Art der Vergleichsgruppe erläutern, auf die sich Ihr Prozentwert bezieht (z. B. Jahrgang, Zahl der von Ihnen betreuten Abschlussarbeiten).</w:t>
       </w:r>
     </w:p>
     <w:p>
@@ -423,24 +437,7 @@
           <w:sz w:val="19"/>
           <w:szCs w:val="19"/>
         </w:rPr>
-        <w:t xml:space="preserve">– Wie groß war die Gruppe, in der Sie ihn erlebt haben?</w:t>
-      </w:r>
-    </w:p>
-    <w:p>
-      <w:pPr>
-        <w:spacing w:after="60" w:line="264"/>
-        <w:ind w:left="259"/>
-      </w:pPr>
-      <w:r>
-        <w:rPr>
-          <w:rFonts w:ascii="Calibri" w:cs="Calibri" w:eastAsia="Calibri" w:hAnsi="Calibri"/>
-          <w:i/>
-          <w:iCs/>
-          <w:color w:val="595959"/>
-          <w:sz w:val="19"/>
-          <w:szCs w:val="19"/>
-        </w:rPr>
-        <w:t xml:space="preserve">– Dies ist der am häufigsten fehlende Abschnitt. Ohne ihn kann die Kommission das Urteil nicht gewichten.</w:t>
+        <w:t xml:space="preserve">– Ohne diese Erläuterung ist der angekreuzte Prozentwert für die Kommission nicht interpretierbar.</w:t>
       </w:r>
     </w:p>
     <w:p>
@@ -519,7 +516,7 @@
           <w:sz w:val="23"/>
           <w:szCs w:val="23"/>
         </w:rPr>
-        <w:t xml:space="preserve">3. Fachliche Qualifikation</w:t>
+        <w:t xml:space="preserve">3. Akademische Qualifikation</w:t>
       </w:r>
       <w:r>
         <w:rPr>
@@ -530,7 +527,27 @@
           <w:sz w:val="18"/>
           <w:szCs w:val="18"/>
         </w:rPr>
-        <w:t xml:space="preserve">   Kernstück · etwa 35–40 % des Schreibens</w:t>
+        <w:t xml:space="preserve">   Kernstück · etwa 35 % · DAAD-Kriterium 1</w:t>
+      </w:r>
+    </w:p>
+    <w:p>
+      <w:pPr>
+        <w:pBdr>
+          <w:left w:val="single" w:color="8FA3C8" w:sz="12" w:space="8"/>
+        </w:pBdr>
+        <w:spacing w:after="70" w:line="264"/>
+        <w:ind w:left="259"/>
+      </w:pPr>
+      <w:r>
+        <w:rPr>
+          <w:rFonts w:ascii="Calibri" w:cs="Calibri" w:eastAsia="Calibri" w:hAnsi="Calibri"/>
+          <w:i/>
+          <w:iCs/>
+          <w:color w:val="2F4470"/>
+          <w:sz w:val="19"/>
+          <w:szCs w:val="19"/>
+        </w:rPr>
+        <w:t xml:space="preserve">„gemessen an Studienleistungen (Notendurchschnitt, Notenentwicklung), Studienverlauf, Kenntnissen der Unterrichts- oder Arbeitssprache, ggf. bereits vorliegenden wissenschaftlichen Leistungen“</w:t>
       </w:r>
     </w:p>
     <w:p>
@@ -547,7 +564,7 @@
           <w:sz w:val="19"/>
           <w:szCs w:val="19"/>
         </w:rPr>
-        <w:t xml:space="preserve">– Bachelorarbeit: Problemwahl, Methode, Ergebnis, Umgang mit Rückschlägen, Qualität der schriftlichen Darstellung.</w:t>
+        <w:t xml:space="preserve">– Notendurchschnitt UND Notenentwicklung — der DAAD nennt die Entwicklung ausdrücklich eigens.</w:t>
       </w:r>
     </w:p>
     <w:p>
@@ -564,7 +581,7 @@
           <w:sz w:val="19"/>
           <w:szCs w:val="19"/>
         </w:rPr>
-        <w:t xml:space="preserve">– Wie ordnet sich die Note in die von Ihnen betreuten Arbeiten ein?</w:t>
+        <w:t xml:space="preserve">– Bereits vorliegende wissenschaftliche Leistungen: die Bachelorarbeit — Problemwahl, Methode, Ergebnis, Umgang mit Rückschlägen, Qualität der schriftlichen Darstellung. Eine konkrete Episode, ausführlich erzählt, wirkt stärker als jede Reihe von Eigenschaftswörtern.</w:t>
       </w:r>
     </w:p>
     <w:p>
@@ -581,7 +598,7 @@
           <w:sz w:val="19"/>
           <w:szCs w:val="19"/>
         </w:rPr>
-        <w:t xml:space="preserve">– Quantitative Fähigkeiten — an welchen Modulen und welcher Prüfungsform lässt sich das belegen?</w:t>
+        <w:t xml:space="preserve">– Kenntnisse der Arbeitssprache: Wie schätzen Sie die Fähigkeit ein, ein englischsprachiges Studium auf diesem Niveau zu absolvieren? Woran machen Sie das fest?</w:t>
       </w:r>
     </w:p>
     <w:p>
@@ -598,7 +615,7 @@
           <w:sz w:val="19"/>
           <w:szCs w:val="19"/>
         </w:rPr>
-        <w:t xml:space="preserve">– Eine konkrete Episode, ausführlich erzählt, wirkt stärker als jede Reihe von Eigenschaftswörtern.</w:t>
+        <w:t xml:space="preserve">– Studienverlauf: Ein Satz dazu, was ein praxisintegriertes duales Studium an der DHBW ist — Wechsel von Theorie- und Vollzeit-Praxisphasen. Für eine Kommission, die diese Hochschulform nicht kennt, ordnet dieser Satz die Leistung erst ein.</w:t>
       </w:r>
     </w:p>
     <w:p>
@@ -752,7 +769,7 @@
           <w:sz w:val="23"/>
           <w:szCs w:val="23"/>
         </w:rPr>
-        <w:t xml:space="preserve">4. Einordnung im Jahrgang</w:t>
+        <w:t xml:space="preserve">4. Qualität des Vorhabens</w:t>
       </w:r>
       <w:r>
         <w:rPr>
@@ -763,7 +780,27 @@
           <w:sz w:val="18"/>
           <w:szCs w:val="18"/>
         </w:rPr>
-        <w:t xml:space="preserve">   1–2 Sätze · nur Sie können das</w:t>
+        <w:t xml:space="preserve">   3–5 Sätze · DAAD-Kriterium 2 · setzt den Studienplan voraus</w:t>
+      </w:r>
+    </w:p>
+    <w:p>
+      <w:pPr>
+        <w:pBdr>
+          <w:left w:val="single" w:color="8FA3C8" w:sz="12" w:space="8"/>
+        </w:pBdr>
+        <w:spacing w:after="70" w:line="264"/>
+        <w:ind w:left="259"/>
+      </w:pPr>
+      <w:r>
+        <w:rPr>
+          <w:rFonts w:ascii="Calibri" w:cs="Calibri" w:eastAsia="Calibri" w:hAnsi="Calibri"/>
+          <w:i/>
+          <w:iCs/>
+          <w:color w:val="2F4470"/>
+          <w:sz w:val="19"/>
+          <w:szCs w:val="19"/>
+        </w:rPr>
+        <w:t xml:space="preserve">„gemessen an Studienplan, ggf. Einbettung des Vorhabens in den bisherigen Studienverlauf/Werdegang“</w:t>
       </w:r>
     </w:p>
     <w:p>
@@ -780,7 +817,7 @@
           <w:sz w:val="19"/>
           <w:szCs w:val="19"/>
         </w:rPr>
-        <w:t xml:space="preserve">– Eine gezählte Aussage mit genanntem Nenner, etwa: „gehört zu den besten ___ von ___ Studierenden, die ich betreut habe“.</w:t>
+        <w:t xml:space="preserve">– Ist der vorgelegte Studienplan fachlich tragfähig?</w:t>
       </w:r>
     </w:p>
     <w:p>
@@ -797,7 +834,86 @@
           <w:sz w:val="19"/>
           <w:szCs w:val="19"/>
         </w:rPr>
-        <w:t xml:space="preserve">– Ohne den Nenner ist die Aussage für eine Kommission nicht interpretierbar; mit ihm ist sie das Einzige, was ein Zeugnis nicht liefern kann.</w:t>
+        <w:t xml:space="preserve">– Einbettung: Wie folgt dieser Studiengang aus einem Wirtschaftsinformatik-Studium und einer Bachelorarbeit im Bereich KI?</w:t>
+      </w:r>
+    </w:p>
+    <w:p>
+      <w:pPr>
+        <w:spacing w:after="60" w:line="264"/>
+        <w:ind w:left="259"/>
+      </w:pPr>
+      <w:r>
+        <w:rPr>
+          <w:rFonts w:ascii="Calibri" w:cs="Calibri" w:eastAsia="Calibri" w:hAnsi="Calibri"/>
+          <w:i/>
+          <w:iCs/>
+          <w:color w:val="595959"/>
+          <w:sz w:val="19"/>
+          <w:szCs w:val="19"/>
+        </w:rPr>
+        <w:t xml:space="preserve">– Trauen Sie dem Bewerber einen elfmonatigen, intensiven, industrienahen MPhil zu?</w:t>
+      </w:r>
+    </w:p>
+    <w:p>
+      <w:pPr>
+        <w:spacing w:after="60" w:line="264"/>
+        <w:ind w:left="259"/>
+      </w:pPr>
+      <w:r>
+        <w:rPr>
+          <w:rFonts w:ascii="Calibri" w:cs="Calibri" w:eastAsia="Calibri" w:hAnsi="Calibri"/>
+          <w:i/>
+          <w:iCs/>
+          <w:color w:val="595959"/>
+          <w:sz w:val="19"/>
+          <w:szCs w:val="19"/>
+        </w:rPr>
+        <w:t xml:space="preserve">– Diesen Punkt kann nur ein Dritter beurteilen — der Bewerber kann ihn über sich selbst nicht sagen.</w:t>
+      </w:r>
+    </w:p>
+    <w:p>
+      <w:pPr>
+        <w:pBdr>
+          <w:bottom w:val="dotted" w:color="C9CFDB" w:sz="4" w:space="2"/>
+        </w:pBdr>
+        <w:spacing w:after="0" w:line="380"/>
+      </w:pPr>
+      <w:r>
+        <w:rPr>
+          <w:sz w:val="21"/>
+          <w:szCs w:val="21"/>
+        </w:rPr>
+        <w:t xml:space="preserve"/>
+      </w:r>
+    </w:p>
+    <w:p>
+      <w:pPr>
+        <w:pBdr>
+          <w:bottom w:val="dotted" w:color="C9CFDB" w:sz="4" w:space="2"/>
+        </w:pBdr>
+        <w:spacing w:after="0" w:line="380"/>
+      </w:pPr>
+      <w:r>
+        <w:rPr>
+          <w:sz w:val="21"/>
+          <w:szCs w:val="21"/>
+        </w:rPr>
+        <w:t xml:space="preserve"/>
+      </w:r>
+    </w:p>
+    <w:p>
+      <w:pPr>
+        <w:pBdr>
+          <w:bottom w:val="dotted" w:color="C9CFDB" w:sz="4" w:space="2"/>
+        </w:pBdr>
+        <w:spacing w:after="0" w:line="380"/>
+      </w:pPr>
+      <w:r>
+        <w:rPr>
+          <w:sz w:val="21"/>
+          <w:szCs w:val="21"/>
+        </w:rPr>
+        <w:t xml:space="preserve"/>
       </w:r>
     </w:p>
     <w:p>
@@ -846,7 +962,7 @@
           <w:sz w:val="23"/>
           <w:szCs w:val="23"/>
         </w:rPr>
-        <w:t xml:space="preserve">5. Persönliche Eignung und Arbeitsweise</w:t>
+        <w:t xml:space="preserve">5. Potenzial</w:t>
       </w:r>
       <w:r>
         <w:rPr>
@@ -857,7 +973,27 @@
           <w:sz w:val="18"/>
           <w:szCs w:val="18"/>
         </w:rPr>
-        <w:t xml:space="preserve">   2–4 Sätze</w:t>
+        <w:t xml:space="preserve">   etwa 25 % · DAAD-Kriterium 3 · drei Unterpunkte</w:t>
+      </w:r>
+    </w:p>
+    <w:p>
+      <w:pPr>
+        <w:pBdr>
+          <w:left w:val="single" w:color="8FA3C8" w:sz="12" w:space="8"/>
+        </w:pBdr>
+        <w:spacing w:after="70" w:line="264"/>
+        <w:ind w:left="259"/>
+      </w:pPr>
+      <w:r>
+        <w:rPr>
+          <w:rFonts w:ascii="Calibri" w:cs="Calibri" w:eastAsia="Calibri" w:hAnsi="Calibri"/>
+          <w:i/>
+          <w:iCs/>
+          <w:color w:val="2F4470"/>
+          <w:sz w:val="19"/>
+          <w:szCs w:val="19"/>
+        </w:rPr>
+        <w:t xml:space="preserve">„gemessen an Motivation (fachliche und persönliche Gründe für den Auslandsaufenthalt), Perspektiven (Bedeutung des Auslandsaufenthalts für die weitere akademische, berufliche und persönliche Entwicklung) und außerfachlichem Engagement (außerfachliche Kenntnisse und Fähigkeiten, gesellschaftliches Engagement)“</w:t>
       </w:r>
     </w:p>
     <w:p>
@@ -874,7 +1010,7 @@
           <w:sz w:val="19"/>
           <w:szCs w:val="19"/>
         </w:rPr>
-        <w:t xml:space="preserve">– Zuverlässigkeit, Eigeninitiative, fachübergreifendes und englischsprachiges Arbeiten.</w:t>
+        <w:t xml:space="preserve">– Motivation: Halten Sie die fachlichen und persönlichen Gründe für tragfähig — und woran haben Sie das beobachtet?</w:t>
       </w:r>
     </w:p>
     <w:p>
@@ -891,7 +1027,69 @@
           <w:sz w:val="19"/>
           <w:szCs w:val="19"/>
         </w:rPr>
-        <w:t xml:space="preserve">– Möglichst an einer beobachteten Situation festgemacht, nicht an Eigenschaftswörtern.</w:t>
+        <w:t xml:space="preserve">– Perspektiven: Was wird der Bewerber nach diesem Studium können, was er heute nicht kann? Nüchtern und begründet, keine Prophezeiung.</w:t>
+      </w:r>
+    </w:p>
+    <w:p>
+      <w:pPr>
+        <w:spacing w:after="60" w:line="264"/>
+        <w:ind w:left="259"/>
+      </w:pPr>
+      <w:r>
+        <w:rPr>
+          <w:rFonts w:ascii="Calibri" w:cs="Calibri" w:eastAsia="Calibri" w:hAnsi="Calibri"/>
+          <w:i/>
+          <w:iCs/>
+          <w:color w:val="595959"/>
+          <w:sz w:val="19"/>
+          <w:szCs w:val="19"/>
+        </w:rPr>
+        <w:t xml:space="preserve">– Außerfachliches Engagement: nur Beobachtetes — etwa, dass erhebliche ehrenamtliche Verantwortung neben dem Studium lief und die Termine dennoch standen. Die Vereinsarbeit selbst haben Sie nicht beobachtet.</w:t>
+      </w:r>
+    </w:p>
+    <w:p>
+      <w:pPr>
+        <w:pBdr>
+          <w:bottom w:val="dotted" w:color="C9CFDB" w:sz="4" w:space="2"/>
+        </w:pBdr>
+        <w:spacing w:after="0" w:line="380"/>
+      </w:pPr>
+      <w:r>
+        <w:rPr>
+          <w:sz w:val="21"/>
+          <w:szCs w:val="21"/>
+        </w:rPr>
+        <w:t xml:space="preserve"/>
+      </w:r>
+    </w:p>
+    <w:p>
+      <w:pPr>
+        <w:pBdr>
+          <w:bottom w:val="dotted" w:color="C9CFDB" w:sz="4" w:space="2"/>
+        </w:pBdr>
+        <w:spacing w:after="0" w:line="380"/>
+      </w:pPr>
+      <w:r>
+        <w:rPr>
+          <w:sz w:val="21"/>
+          <w:szCs w:val="21"/>
+        </w:rPr>
+        <w:t xml:space="preserve"/>
+      </w:r>
+    </w:p>
+    <w:p>
+      <w:pPr>
+        <w:pBdr>
+          <w:bottom w:val="dotted" w:color="C9CFDB" w:sz="4" w:space="2"/>
+        </w:pBdr>
+        <w:spacing w:after="0" w:line="380"/>
+      </w:pPr>
+      <w:r>
+        <w:rPr>
+          <w:sz w:val="21"/>
+          <w:szCs w:val="21"/>
+        </w:rPr>
+        <w:t xml:space="preserve"/>
       </w:r>
     </w:p>
     <w:p>
@@ -970,7 +1168,7 @@
           <w:sz w:val="23"/>
           <w:szCs w:val="23"/>
         </w:rPr>
-        <w:t xml:space="preserve">6. Duales Studium an der DHBW</w:t>
+        <w:t xml:space="preserve">6. Befürwortung</w:t>
       </w:r>
       <w:r>
         <w:rPr>
@@ -981,7 +1179,7 @@
           <w:sz w:val="18"/>
           <w:szCs w:val="18"/>
         </w:rPr>
-        <w:t xml:space="preserve">   1 Satz · wichtig</w:t>
+        <w:t xml:space="preserve">   1–2 Sätze · uneingeschränkt</w:t>
       </w:r>
     </w:p>
     <w:p>
@@ -998,7 +1196,7 @@
           <w:sz w:val="19"/>
           <w:szCs w:val="19"/>
         </w:rPr>
-        <w:t xml:space="preserve">– Ein Satz dazu, was ein praxisintegriertes duales Studium ist: Wechsel von Theorie- und Vollzeit-Praxisphasen.</w:t>
+        <w:t xml:space="preserve">– Der DAAD verlangt ein „unterstützendes“ Empfehlungsschreiben; ein relativierender Schluss erfüllt das formal nicht.</w:t>
       </w:r>
     </w:p>
     <w:p>
@@ -1015,7 +1213,7 @@
           <w:sz w:val="19"/>
           <w:szCs w:val="19"/>
         </w:rPr>
-        <w:t xml:space="preserve">– Für eine Kommission, die die DHBW nicht kennt, macht dieser Satz aus einer Unbekannten einen Pluspunkt: Die akademische Leistung entstand unter dieser Doppelbelastung.</w:t>
+        <w:t xml:space="preserve">– Register: weder angloamerikanische Superlativketten noch deutsche Bescheidenheitsmarker wie „durchaus solide“ — Letzteres liest eine Kommission als Kritik.</w:t>
       </w:r>
     </w:p>
     <w:p>
@@ -1064,7 +1262,7 @@
           <w:sz w:val="23"/>
           <w:szCs w:val="23"/>
         </w:rPr>
-        <w:t xml:space="preserve">7. Außerfachliches Engagement</w:t>
+        <w:t xml:space="preserve">7. Briefkopf, Datum, Unterschrift</w:t>
       </w:r>
       <w:r>
         <w:rPr>
@@ -1075,7 +1273,7 @@
           <w:sz w:val="18"/>
           <w:szCs w:val="18"/>
         </w:rPr>
-        <w:t xml:space="preserve">   höchstens 1–2 Sätze · nur Beobachtetes</w:t>
+        <w:t xml:space="preserve">   laut Deckblatt vorgeschrieben</w:t>
       </w:r>
     </w:p>
     <w:p>
@@ -1092,7 +1290,7 @@
           <w:sz w:val="19"/>
           <w:szCs w:val="19"/>
         </w:rPr>
-        <w:t xml:space="preserve">– Dass erhebliche ehrenamtliche Verantwortung neben dem Studium lief und die Termine dennoch standen.</w:t>
+        <w:t xml:space="preserve">– Das Schreiben soll auf dem Briefbogen und mit Briefkopf des Instituts bzw. Lehrstuhls erstellt werden.</w:t>
       </w:r>
     </w:p>
     <w:p>
@@ -1109,475 +1307,7 @@
           <w:sz w:val="19"/>
           <w:szCs w:val="19"/>
         </w:rPr>
-        <w:t xml:space="preserve">– Die Vereinsarbeit selbst haben Sie nicht beobachtet — bitte nicht darüber hinausgehen.</w:t>
-      </w:r>
-    </w:p>
-    <w:p>
-      <w:pPr>
-        <w:pBdr>
-          <w:bottom w:val="dotted" w:color="C9CFDB" w:sz="4" w:space="2"/>
-        </w:pBdr>
-        <w:spacing w:after="0" w:line="380"/>
-      </w:pPr>
-      <w:r>
-        <w:rPr>
-          <w:sz w:val="21"/>
-          <w:szCs w:val="21"/>
-        </w:rPr>
-        <w:t xml:space="preserve"/>
-      </w:r>
-    </w:p>
-    <w:p>
-      <w:pPr>
-        <w:pBdr>
-          <w:bottom w:val="dotted" w:color="C9CFDB" w:sz="4" w:space="2"/>
-        </w:pBdr>
-        <w:spacing w:after="0" w:line="380"/>
-      </w:pPr>
-      <w:r>
-        <w:rPr>
-          <w:sz w:val="21"/>
-          <w:szCs w:val="21"/>
-        </w:rPr>
-        <w:t xml:space="preserve"/>
-      </w:r>
-    </w:p>
-    <w:p>
-      <w:pPr>
-        <w:pBdr>
-          <w:bottom w:val="single" w:color="BFC7D5" w:sz="6" w:space="4"/>
-        </w:pBdr>
-        <w:spacing w:after="80" w:before="300"/>
-      </w:pPr>
-      <w:r>
-        <w:rPr>
-          <w:rFonts w:ascii="Calibri" w:cs="Calibri" w:eastAsia="Calibri" w:hAnsi="Calibri"/>
-          <w:b/>
-          <w:bCs/>
-          <w:color w:val="1F3864"/>
-          <w:sz w:val="23"/>
-          <w:szCs w:val="23"/>
-        </w:rPr>
-        <w:t xml:space="preserve">8. Passung zum Vorhaben</w:t>
-      </w:r>
-      <w:r>
-        <w:rPr>
-          <w:rFonts w:ascii="Calibri" w:cs="Calibri" w:eastAsia="Calibri" w:hAnsi="Calibri"/>
-          <w:i/>
-          <w:iCs/>
-          <w:color w:val="595959"/>
-          <w:sz w:val="18"/>
-          <w:szCs w:val="18"/>
-        </w:rPr>
-        <w:t xml:space="preserve">   3–5 Sätze · setzt den Studienplan voraus</w:t>
-      </w:r>
-    </w:p>
-    <w:p>
-      <w:pPr>
-        <w:spacing w:after="60" w:line="264"/>
-        <w:ind w:left="259"/>
-      </w:pPr>
-      <w:r>
-        <w:rPr>
-          <w:rFonts w:ascii="Calibri" w:cs="Calibri" w:eastAsia="Calibri" w:hAnsi="Calibri"/>
-          <w:i/>
-          <w:iCs/>
-          <w:color w:val="595959"/>
-          <w:sz w:val="19"/>
-          <w:szCs w:val="19"/>
-        </w:rPr>
-        <w:t xml:space="preserve">– Warum folgt dieser Studiengang aus einem Wirtschaftsinformatik-Studium und einer KI-Bachelorarbeit?</w:t>
-      </w:r>
-    </w:p>
-    <w:p>
-      <w:pPr>
-        <w:spacing w:after="60" w:line="264"/>
-        <w:ind w:left="259"/>
-      </w:pPr>
-      <w:r>
-        <w:rPr>
-          <w:rFonts w:ascii="Calibri" w:cs="Calibri" w:eastAsia="Calibri" w:hAnsi="Calibri"/>
-          <w:i/>
-          <w:iCs/>
-          <w:color w:val="595959"/>
-          <w:sz w:val="19"/>
-          <w:szCs w:val="19"/>
-        </w:rPr>
-        <w:t xml:space="preserve">– Trauen Sie dem Bewerber einen elfmonatigen, intensiven, industrienahen MPhil zu?</w:t>
-      </w:r>
-    </w:p>
-    <w:p>
-      <w:pPr>
-        <w:spacing w:after="60" w:line="264"/>
-        <w:ind w:left="259"/>
-      </w:pPr>
-      <w:r>
-        <w:rPr>
-          <w:rFonts w:ascii="Calibri" w:cs="Calibri" w:eastAsia="Calibri" w:hAnsi="Calibri"/>
-          <w:i/>
-          <w:iCs/>
-          <w:color w:val="595959"/>
-          <w:sz w:val="19"/>
-          <w:szCs w:val="19"/>
-        </w:rPr>
-        <w:t xml:space="preserve">– Wäre eine gleichwertige Ausbildung in Deutschland verfügbar?</w:t>
-      </w:r>
-    </w:p>
-    <w:p>
-      <w:pPr>
-        <w:spacing w:after="60" w:line="264"/>
-        <w:ind w:left="259"/>
-      </w:pPr>
-      <w:r>
-        <w:rPr>
-          <w:rFonts w:ascii="Calibri" w:cs="Calibri" w:eastAsia="Calibri" w:hAnsi="Calibri"/>
-          <w:i/>
-          <w:iCs/>
-          <w:color w:val="595959"/>
-          <w:sz w:val="19"/>
-          <w:szCs w:val="19"/>
-        </w:rPr>
-        <w:t xml:space="preserve">– Diesen Punkt kann nur ein Dritter beurteilen — der Bewerber kann ihn über sich selbst nicht sagen.</w:t>
-      </w:r>
-    </w:p>
-    <w:p>
-      <w:pPr>
-        <w:pBdr>
-          <w:bottom w:val="dotted" w:color="C9CFDB" w:sz="4" w:space="2"/>
-        </w:pBdr>
-        <w:spacing w:after="0" w:line="380"/>
-      </w:pPr>
-      <w:r>
-        <w:rPr>
-          <w:sz w:val="21"/>
-          <w:szCs w:val="21"/>
-        </w:rPr>
-        <w:t xml:space="preserve"/>
-      </w:r>
-    </w:p>
-    <w:p>
-      <w:pPr>
-        <w:pBdr>
-          <w:bottom w:val="dotted" w:color="C9CFDB" w:sz="4" w:space="2"/>
-        </w:pBdr>
-        <w:spacing w:after="0" w:line="380"/>
-      </w:pPr>
-      <w:r>
-        <w:rPr>
-          <w:sz w:val="21"/>
-          <w:szCs w:val="21"/>
-        </w:rPr>
-        <w:t xml:space="preserve"/>
-      </w:r>
-    </w:p>
-    <w:p>
-      <w:pPr>
-        <w:pBdr>
-          <w:bottom w:val="dotted" w:color="C9CFDB" w:sz="4" w:space="2"/>
-        </w:pBdr>
-        <w:spacing w:after="0" w:line="380"/>
-      </w:pPr>
-      <w:r>
-        <w:rPr>
-          <w:sz w:val="21"/>
-          <w:szCs w:val="21"/>
-        </w:rPr>
-        <w:t xml:space="preserve"/>
-      </w:r>
-    </w:p>
-    <w:p>
-      <w:pPr>
-        <w:pBdr>
-          <w:bottom w:val="dotted" w:color="C9CFDB" w:sz="4" w:space="2"/>
-        </w:pBdr>
-        <w:spacing w:after="0" w:line="380"/>
-      </w:pPr>
-      <w:r>
-        <w:rPr>
-          <w:sz w:val="21"/>
-          <w:szCs w:val="21"/>
-        </w:rPr>
-        <w:t xml:space="preserve"/>
-      </w:r>
-    </w:p>
-    <w:p>
-      <w:pPr>
-        <w:pBdr>
-          <w:bottom w:val="dotted" w:color="C9CFDB" w:sz="4" w:space="2"/>
-        </w:pBdr>
-        <w:spacing w:after="0" w:line="380"/>
-      </w:pPr>
-      <w:r>
-        <w:rPr>
-          <w:sz w:val="21"/>
-          <w:szCs w:val="21"/>
-        </w:rPr>
-        <w:t xml:space="preserve"/>
-      </w:r>
-    </w:p>
-    <w:p>
-      <w:pPr>
-        <w:pBdr>
-          <w:bottom w:val="single" w:color="BFC7D5" w:sz="6" w:space="4"/>
-        </w:pBdr>
-        <w:spacing w:after="80" w:before="300"/>
-      </w:pPr>
-      <w:r>
-        <w:rPr>
-          <w:rFonts w:ascii="Calibri" w:cs="Calibri" w:eastAsia="Calibri" w:hAnsi="Calibri"/>
-          <w:b/>
-          <w:bCs/>
-          <w:color w:val="1F3864"/>
-          <w:sz w:val="23"/>
-          <w:szCs w:val="23"/>
-        </w:rPr>
-        <w:t xml:space="preserve">9. Perspektive</w:t>
-      </w:r>
-      <w:r>
-        <w:rPr>
-          <w:rFonts w:ascii="Calibri" w:cs="Calibri" w:eastAsia="Calibri" w:hAnsi="Calibri"/>
-          <w:i/>
-          <w:iCs/>
-          <w:color w:val="595959"/>
-          <w:sz w:val="18"/>
-          <w:szCs w:val="18"/>
-        </w:rPr>
-        <w:t xml:space="preserve">   2–3 Sätze</w:t>
-      </w:r>
-    </w:p>
-    <w:p>
-      <w:pPr>
-        <w:spacing w:after="60" w:line="264"/>
-        <w:ind w:left="259"/>
-      </w:pPr>
-      <w:r>
-        <w:rPr>
-          <w:rFonts w:ascii="Calibri" w:cs="Calibri" w:eastAsia="Calibri" w:hAnsi="Calibri"/>
-          <w:i/>
-          <w:iCs/>
-          <w:color w:val="595959"/>
-          <w:sz w:val="19"/>
-          <w:szCs w:val="19"/>
-        </w:rPr>
-        <w:t xml:space="preserve">– Nüchterne, begründete Einschätzung, was der Bewerber nach dem Studium können wird — verankert in dem, was Sie beobachtet haben.</w:t>
-      </w:r>
-    </w:p>
-    <w:p>
-      <w:pPr>
-        <w:pBdr>
-          <w:bottom w:val="dotted" w:color="C9CFDB" w:sz="4" w:space="2"/>
-        </w:pBdr>
-        <w:spacing w:after="0" w:line="380"/>
-      </w:pPr>
-      <w:r>
-        <w:rPr>
-          <w:sz w:val="21"/>
-          <w:szCs w:val="21"/>
-        </w:rPr>
-        <w:t xml:space="preserve"/>
-      </w:r>
-    </w:p>
-    <w:p>
-      <w:pPr>
-        <w:pBdr>
-          <w:bottom w:val="dotted" w:color="C9CFDB" w:sz="4" w:space="2"/>
-        </w:pBdr>
-        <w:spacing w:after="0" w:line="380"/>
-      </w:pPr>
-      <w:r>
-        <w:rPr>
-          <w:sz w:val="21"/>
-          <w:szCs w:val="21"/>
-        </w:rPr>
-        <w:t xml:space="preserve"/>
-      </w:r>
-    </w:p>
-    <w:p>
-      <w:pPr>
-        <w:pBdr>
-          <w:bottom w:val="dotted" w:color="C9CFDB" w:sz="4" w:space="2"/>
-        </w:pBdr>
-        <w:spacing w:after="0" w:line="380"/>
-      </w:pPr>
-      <w:r>
-        <w:rPr>
-          <w:sz w:val="21"/>
-          <w:szCs w:val="21"/>
-        </w:rPr>
-        <w:t xml:space="preserve"/>
-      </w:r>
-    </w:p>
-    <w:p>
-      <w:pPr>
-        <w:pBdr>
-          <w:bottom w:val="single" w:color="BFC7D5" w:sz="6" w:space="4"/>
-        </w:pBdr>
-        <w:spacing w:after="80" w:before="300"/>
-      </w:pPr>
-      <w:r>
-        <w:rPr>
-          <w:rFonts w:ascii="Calibri" w:cs="Calibri" w:eastAsia="Calibri" w:hAnsi="Calibri"/>
-          <w:b/>
-          <w:bCs/>
-          <w:color w:val="1F3864"/>
-          <w:sz w:val="23"/>
-          <w:szCs w:val="23"/>
-        </w:rPr>
-        <w:t xml:space="preserve">10. Befürwortung</w:t>
-      </w:r>
-      <w:r>
-        <w:rPr>
-          <w:rFonts w:ascii="Calibri" w:cs="Calibri" w:eastAsia="Calibri" w:hAnsi="Calibri"/>
-          <w:i/>
-          <w:iCs/>
-          <w:color w:val="595959"/>
-          <w:sz w:val="18"/>
-          <w:szCs w:val="18"/>
-        </w:rPr>
-        <w:t xml:space="preserve">   1–2 Sätze · uneingeschränkt</w:t>
-      </w:r>
-    </w:p>
-    <w:p>
-      <w:pPr>
-        <w:spacing w:after="60" w:line="264"/>
-        <w:ind w:left="259"/>
-      </w:pPr>
-      <w:r>
-        <w:rPr>
-          <w:rFonts w:ascii="Calibri" w:cs="Calibri" w:eastAsia="Calibri" w:hAnsi="Calibri"/>
-          <w:i/>
-          <w:iCs/>
-          <w:color w:val="595959"/>
-          <w:sz w:val="19"/>
-          <w:szCs w:val="19"/>
-        </w:rPr>
-        <w:t xml:space="preserve">– Ein klarer Satz zur Unterstützung der Bewerbung.</w:t>
-      </w:r>
-    </w:p>
-    <w:p>
-      <w:pPr>
-        <w:spacing w:after="60" w:line="264"/>
-        <w:ind w:left="259"/>
-      </w:pPr>
-      <w:r>
-        <w:rPr>
-          <w:rFonts w:ascii="Calibri" w:cs="Calibri" w:eastAsia="Calibri" w:hAnsi="Calibri"/>
-          <w:i/>
-          <w:iCs/>
-          <w:color w:val="595959"/>
-          <w:sz w:val="19"/>
-          <w:szCs w:val="19"/>
-        </w:rPr>
-        <w:t xml:space="preserve">– Der DAAD verlangt ein unterstützendes Gutachten; ein relativierender Schluss erfüllt das formal nicht.</w:t>
-      </w:r>
-    </w:p>
-    <w:p>
-      <w:pPr>
-        <w:spacing w:after="60" w:line="264"/>
-        <w:ind w:left="259"/>
-      </w:pPr>
-      <w:r>
-        <w:rPr>
-          <w:rFonts w:ascii="Calibri" w:cs="Calibri" w:eastAsia="Calibri" w:hAnsi="Calibri"/>
-          <w:i/>
-          <w:iCs/>
-          <w:color w:val="595959"/>
-          <w:sz w:val="19"/>
-          <w:szCs w:val="19"/>
-        </w:rPr>
-        <w:t xml:space="preserve">– Register: weder angloamerikanische Superlativketten noch deutsche Bescheidenheitsmarker wie „durchaus solide“ — Letzteres liest eine Kommission als Kritik.</w:t>
-      </w:r>
-    </w:p>
-    <w:p>
-      <w:pPr>
-        <w:pBdr>
-          <w:bottom w:val="dotted" w:color="C9CFDB" w:sz="4" w:space="2"/>
-        </w:pBdr>
-        <w:spacing w:after="0" w:line="380"/>
-      </w:pPr>
-      <w:r>
-        <w:rPr>
-          <w:sz w:val="21"/>
-          <w:szCs w:val="21"/>
-        </w:rPr>
-        <w:t xml:space="preserve"/>
-      </w:r>
-    </w:p>
-    <w:p>
-      <w:pPr>
-        <w:pBdr>
-          <w:bottom w:val="dotted" w:color="C9CFDB" w:sz="4" w:space="2"/>
-        </w:pBdr>
-        <w:spacing w:after="0" w:line="380"/>
-      </w:pPr>
-      <w:r>
-        <w:rPr>
-          <w:sz w:val="21"/>
-          <w:szCs w:val="21"/>
-        </w:rPr>
-        <w:t xml:space="preserve"/>
-      </w:r>
-    </w:p>
-    <w:p>
-      <w:pPr>
-        <w:pBdr>
-          <w:bottom w:val="single" w:color="BFC7D5" w:sz="6" w:space="4"/>
-        </w:pBdr>
-        <w:spacing w:after="80" w:before="300"/>
-      </w:pPr>
-      <w:r>
-        <w:rPr>
-          <w:rFonts w:ascii="Calibri" w:cs="Calibri" w:eastAsia="Calibri" w:hAnsi="Calibri"/>
-          <w:b/>
-          <w:bCs/>
-          <w:color w:val="1F3864"/>
-          <w:sz w:val="23"/>
-          <w:szCs w:val="23"/>
-        </w:rPr>
-        <w:t xml:space="preserve">11. Unterschrift</w:t>
-      </w:r>
-      <w:r>
-        <w:rPr>
-          <w:rFonts w:ascii="Calibri" w:cs="Calibri" w:eastAsia="Calibri" w:hAnsi="Calibri"/>
-          <w:i/>
-          <w:iCs/>
-          <w:color w:val="595959"/>
-          <w:sz w:val="18"/>
-          <w:szCs w:val="18"/>
-        </w:rPr>
-        <w:t xml:space="preserve">   4–6 Zeilen</w:t>
-      </w:r>
-    </w:p>
-    <w:p>
-      <w:pPr>
-        <w:spacing w:after="60" w:line="264"/>
-        <w:ind w:left="259"/>
-      </w:pPr>
-      <w:r>
-        <w:rPr>
-          <w:rFonts w:ascii="Calibri" w:cs="Calibri" w:eastAsia="Calibri" w:hAnsi="Calibri"/>
-          <w:i/>
-          <w:iCs/>
-          <w:color w:val="595959"/>
-          <w:sz w:val="19"/>
-          <w:szCs w:val="19"/>
-        </w:rPr>
-        <w:t xml:space="preserve">– Vollständiger Name, Titel, Lehrstuhl oder Studiengang, Institution, Kontaktdaten, Angebot zur Rückfrage, Datum, Unterschrift.</w:t>
-      </w:r>
-    </w:p>
-    <w:p>
-      <w:pPr>
-        <w:pBdr>
-          <w:bottom w:val="dotted" w:color="C9CFDB" w:sz="4" w:space="2"/>
-        </w:pBdr>
-        <w:spacing w:after="0" w:line="380"/>
-      </w:pPr>
-      <w:r>
-        <w:rPr>
-          <w:sz w:val="21"/>
-          <w:szCs w:val="21"/>
-        </w:rPr>
-        <w:t xml:space="preserve"/>
+        <w:t xml:space="preserve">– Unterschrift handschriftlich oder elektronisch; Kontaktdaten für Rückfragen stehen bereits auf dem Deckblatt.</w:t>
       </w:r>
     </w:p>
     <w:p>
@@ -1726,7 +1456,7 @@
                 <w:sz w:val="19"/>
                 <w:szCs w:val="19"/>
               </w:rPr>
-              <w:t xml:space="preserve">Rangaussagen ohne genannte Vergleichsgruppe.</w:t>
+              <w:t xml:space="preserve">Eine Rangaussage ohne erläuterte Vergleichsgruppe — das Deckblatt verlangt die Erläuterung ausdrücklich.</w:t>
             </w:r>
           </w:p>
           <w:p>

</xml_diff>